<commit_message>
Save equations as LaTeX source in Courier New (numbered, Alt+= renderable)
Co-Authored-By: Claude Sonnet 4.6 <noreply@anthropic.com>
</commit_message>
<xml_diff>
--- a/output/VUCA_paper_draft.docx
+++ b/output/VUCA_paper_draft.docx
@@ -1090,17 +1090,36 @@
     </w:p>
     <w:p>
       <w:pPr>
-        <w:spacing w:line="480" w:lineRule="exact" w:before="80" w:after="80"/>
+        <w:spacing w:line="360" w:lineRule="exact" w:before="120" w:after="120"/>
         <w:ind w:left="720"/>
       </w:pPr>
       <w:r>
         <w:rPr>
           <w:rFonts w:ascii="Times New Roman" w:hAnsi="Times New Roman"/>
-          <w:b w:val="0"/>
+          <w:sz w:val="22"/>
+        </w:rPr>
+        <w:t xml:space="preserve">(1)  </w:t>
+      </w:r>
+      <w:r>
+        <w:rPr>
+          <w:rFonts w:ascii="Courier New" w:hAnsi="Courier New"/>
+          <w:sz w:val="20"/>
+        </w:rPr>
+        <w:t>z_{it} = \frac{x_{it} - \bar{x}_{i,\text{base}}}{\sigma_{i,\text{base}}}</w:t>
+      </w:r>
+    </w:p>
+    <w:p>
+      <w:pPr>
+        <w:spacing w:after="40" w:line="280" w:lineRule="exact"/>
+        <w:ind w:left="720"/>
+      </w:pPr>
+      <w:r>
+        <w:rPr>
+          <w:rFonts w:ascii="Times New Roman" w:hAnsi="Times New Roman"/>
           <w:i/>
-          <w:sz w:val="24"/>
+          <w:sz w:val="18"/>
         </w:rPr>
-        <w:t>[EQ 1]  z_it = (x_it - x_i,base_mean) / sigma_i,base</w:t>
+        <w:t>[To render: In Word, place cursor after equation, press Alt+=, then paste the LaTeX source into the equation editor]</w:t>
       </w:r>
     </w:p>
     <w:p>
@@ -1135,17 +1154,22 @@
     </w:p>
     <w:p>
       <w:pPr>
-        <w:spacing w:line="480" w:lineRule="exact" w:before="80" w:after="80"/>
+        <w:spacing w:line="360" w:lineRule="exact" w:before="120" w:after="120"/>
         <w:ind w:left="720"/>
       </w:pPr>
       <w:r>
         <w:rPr>
           <w:rFonts w:ascii="Times New Roman" w:hAnsi="Times New Roman"/>
-          <w:b w:val="0"/>
-          <w:i/>
-          <w:sz w:val="24"/>
+          <w:sz w:val="22"/>
         </w:rPr>
-        <w:t>[EQ 2]  VUCA_d,t = (1/2)(z_d,quant,t + z_d,text,t)</w:t>
+        <w:t xml:space="preserve">(2)  </w:t>
+      </w:r>
+      <w:r>
+        <w:rPr>
+          <w:rFonts w:ascii="Courier New" w:hAnsi="Courier New"/>
+          <w:sz w:val="20"/>
+        </w:rPr>
+        <w:t>\text{VUCA}_{d,t} = \frac{1}{2}\left(z_{d,\text{quant},t} + z_{d,\text{text},t}\right)</w:t>
       </w:r>
     </w:p>
     <w:p>
@@ -1195,17 +1219,22 @@
     </w:p>
     <w:p>
       <w:pPr>
-        <w:spacing w:line="480" w:lineRule="exact" w:before="80" w:after="80"/>
+        <w:spacing w:line="360" w:lineRule="exact" w:before="120" w:after="120"/>
         <w:ind w:left="720"/>
       </w:pPr>
       <w:r>
         <w:rPr>
           <w:rFonts w:ascii="Times New Roman" w:hAnsi="Times New Roman"/>
-          <w:b w:val="0"/>
-          <w:i/>
-          <w:sz w:val="24"/>
+          <w:sz w:val="22"/>
         </w:rPr>
-        <w:t>[EQ 3]  V_quant,t = SD(delta_AEB_{t-11}, ..., delta_AEB_t)</w:t>
+        <w:t xml:space="preserve">(3)  </w:t>
+      </w:r>
+      <w:r>
+        <w:rPr>
+          <w:rFonts w:ascii="Courier New" w:hAnsi="Courier New"/>
+          <w:sz w:val="20"/>
+        </w:rPr>
+        <w:t>V_{\text{quant},t} = \text{SD}\left(\Delta\overline{\text{AEB}}_{t-11}, \ldots, \Delta\overline{\text{AEB}}_{t}\right)</w:t>
       </w:r>
     </w:p>
     <w:p>
@@ -1240,17 +1269,22 @@
     </w:p>
     <w:p>
       <w:pPr>
-        <w:spacing w:line="480" w:lineRule="exact" w:before="80" w:after="80"/>
+        <w:spacing w:line="360" w:lineRule="exact" w:before="120" w:after="120"/>
         <w:ind w:left="720"/>
       </w:pPr>
       <w:r>
         <w:rPr>
           <w:rFonts w:ascii="Times New Roman" w:hAnsi="Times New Roman"/>
-          <w:b w:val="0"/>
-          <w:i/>
-          <w:sz w:val="24"/>
+          <w:sz w:val="22"/>
         </w:rPr>
-        <w:t>[EQ 4]  V_text,t = 1 - |T_t intersect T_{t-1}| / |T_t union T_{t-1}|</w:t>
+        <w:t xml:space="preserve">(4)  </w:t>
+      </w:r>
+      <w:r>
+        <w:rPr>
+          <w:rFonts w:ascii="Courier New" w:hAnsi="Courier New"/>
+          <w:sz w:val="20"/>
+        </w:rPr>
+        <w:t>V_{\text{text},t} = 1 - \frac{|T_t \cap T_{t-1}|}{|T_t \cup T_{t-1}|}</w:t>
       </w:r>
     </w:p>
     <w:p>
@@ -1300,17 +1334,22 @@
     </w:p>
     <w:p>
       <w:pPr>
-        <w:spacing w:line="480" w:lineRule="exact" w:before="80" w:after="80"/>
+        <w:spacing w:line="360" w:lineRule="exact" w:before="120" w:after="120"/>
         <w:ind w:left="720"/>
       </w:pPr>
       <w:r>
         <w:rPr>
           <w:rFonts w:ascii="Times New Roman" w:hAnsi="Times New Roman"/>
-          <w:b w:val="0"/>
-          <w:i/>
-          <w:sz w:val="24"/>
+          <w:sz w:val="22"/>
         </w:rPr>
-        <w:t>[EQ 5]  U_quant,t = -mean_IFE_t</w:t>
+        <w:t xml:space="preserve">(5)  </w:t>
+      </w:r>
+      <w:r>
+        <w:rPr>
+          <w:rFonts w:ascii="Courier New" w:hAnsi="Courier New"/>
+          <w:sz w:val="20"/>
+        </w:rPr>
+        <w:t>U_{\text{quant},t} = -\overline{\text{IFE}}_t</w:t>
       </w:r>
     </w:p>
     <w:p>
@@ -1489,17 +1528,22 @@
     </w:p>
     <w:p>
       <w:pPr>
-        <w:spacing w:line="480" w:lineRule="exact" w:before="80" w:after="80"/>
+        <w:spacing w:line="360" w:lineRule="exact" w:before="120" w:after="120"/>
         <w:ind w:left="720"/>
       </w:pPr>
       <w:r>
         <w:rPr>
           <w:rFonts w:ascii="Times New Roman" w:hAnsi="Times New Roman"/>
-          <w:b w:val="0"/>
-          <w:i/>
-          <w:sz w:val="24"/>
+          <w:sz w:val="22"/>
         </w:rPr>
-        <w:t>[EQ 6]  U_text,t = (1/N_t) * sum_i 1[exists w in D_U : w in r_it]</w:t>
+        <w:t xml:space="preserve">(6)  </w:t>
+      </w:r>
+      <w:r>
+        <w:rPr>
+          <w:rFonts w:ascii="Courier New" w:hAnsi="Courier New"/>
+          <w:sz w:val="20"/>
+        </w:rPr>
+        <w:t>U_{\text{text},t} = \frac{1}{N_t} \sum_{i=1}^{N_t} \mathbf{1}\left[\exists\, w \in \mathcal{D}_U : w \in r_{it}\right]</w:t>
       </w:r>
     </w:p>
     <w:p>
@@ -1564,17 +1608,22 @@
     </w:p>
     <w:p>
       <w:pPr>
-        <w:spacing w:line="480" w:lineRule="exact" w:before="80" w:after="80"/>
+        <w:spacing w:line="360" w:lineRule="exact" w:before="120" w:after="120"/>
         <w:ind w:left="720"/>
       </w:pPr>
       <w:r>
         <w:rPr>
           <w:rFonts w:ascii="Times New Roman" w:hAnsi="Times New Roman"/>
-          <w:b w:val="0"/>
-          <w:i/>
-          <w:sz w:val="24"/>
+          <w:sz w:val="22"/>
         </w:rPr>
-        <w:t>[EQ 7]  C_text,t = (1/N_t) * sum_i H(theta_it),  H(theta) = -sum_k theta_k log theta_k</w:t>
+        <w:t xml:space="preserve">(7)  </w:t>
+      </w:r>
+      <w:r>
+        <w:rPr>
+          <w:rFonts w:ascii="Courier New" w:hAnsi="Courier New"/>
+          <w:sz w:val="20"/>
+        </w:rPr>
+        <w:t>C_{\text{text},t} = \frac{1}{N_t} \sum_{i=1}^{N_t} H(\boldsymbol{\theta}_{it})</w:t>
       </w:r>
     </w:p>
     <w:p>
@@ -1609,17 +1658,22 @@
     </w:p>
     <w:p>
       <w:pPr>
-        <w:spacing w:line="480" w:lineRule="exact" w:before="80" w:after="80"/>
+        <w:spacing w:line="360" w:lineRule="exact" w:before="120" w:after="120"/>
         <w:ind w:left="720"/>
       </w:pPr>
       <w:r>
         <w:rPr>
           <w:rFonts w:ascii="Times New Roman" w:hAnsi="Times New Roman"/>
-          <w:b w:val="0"/>
-          <w:i/>
-          <w:sz w:val="24"/>
+          <w:sz w:val="22"/>
         </w:rPr>
-        <w:t>[EQ 8]  C_quant,t = 1 - lambda_1^(t)</w:t>
+        <w:t xml:space="preserve">(8)  </w:t>
+      </w:r>
+      <w:r>
+        <w:rPr>
+          <w:rFonts w:ascii="Courier New" w:hAnsi="Courier New"/>
+          <w:sz w:val="20"/>
+        </w:rPr>
+        <w:t>C_{\text{quant},t} = 1 - \lambda_1^{(t)}</w:t>
       </w:r>
     </w:p>
     <w:p>
@@ -1684,17 +1738,22 @@
     </w:p>
     <w:p>
       <w:pPr>
-        <w:spacing w:line="480" w:lineRule="exact" w:before="80" w:after="80"/>
+        <w:spacing w:line="360" w:lineRule="exact" w:before="120" w:after="120"/>
         <w:ind w:left="720"/>
       </w:pPr>
       <w:r>
         <w:rPr>
           <w:rFonts w:ascii="Times New Roman" w:hAnsi="Times New Roman"/>
-          <w:b w:val="0"/>
-          <w:i/>
-          <w:sz w:val="24"/>
+          <w:sz w:val="22"/>
         </w:rPr>
-        <w:t>[EQ 9]  A_quant,t = (1/3)(z_Akurt,t + z_Adip,t + z_Aflip,t)</w:t>
+        <w:t xml:space="preserve">(9)  </w:t>
+      </w:r>
+      <w:r>
+        <w:rPr>
+          <w:rFonts w:ascii="Courier New" w:hAnsi="Courier New"/>
+          <w:sz w:val="20"/>
+        </w:rPr>
+        <w:t>A_{\text{quant},t} = \frac{1}{3}\left(z_{A_{\text{kurt}},t} + z_{A_{\text{dip}},t} + z_{A_{\text{flip}},t}\right)</w:t>
       </w:r>
     </w:p>
     <w:p>
@@ -1894,17 +1953,22 @@
     </w:p>
     <w:p>
       <w:pPr>
-        <w:spacing w:line="480" w:lineRule="exact" w:before="80" w:after="80"/>
+        <w:spacing w:line="360" w:lineRule="exact" w:before="120" w:after="120"/>
         <w:ind w:left="720"/>
       </w:pPr>
       <w:r>
         <w:rPr>
           <w:rFonts w:ascii="Times New Roman" w:hAnsi="Times New Roman"/>
-          <w:b w:val="0"/>
-          <w:i/>
-          <w:sz w:val="24"/>
+          <w:sz w:val="22"/>
         </w:rPr>
-        <w:t>[EQ 10]  A_text,t = (1/2)(z_Apol,t + z_Aphr,t)</w:t>
+        <w:t xml:space="preserve">(10)  </w:t>
+      </w:r>
+      <w:r>
+        <w:rPr>
+          <w:rFonts w:ascii="Courier New" w:hAnsi="Courier New"/>
+          <w:sz w:val="20"/>
+        </w:rPr>
+        <w:t>A_{\text{text},t} = \frac{1}{2}\left(z_{A_{\text{pol}},t} + z_{A_{\text{phr}},t}\right)</w:t>
       </w:r>
     </w:p>
     <w:p>
@@ -2082,17 +2146,22 @@
     </w:p>
     <w:p>
       <w:pPr>
-        <w:spacing w:line="480" w:lineRule="exact" w:before="80" w:after="80"/>
+        <w:spacing w:line="360" w:lineRule="exact" w:before="120" w:after="120"/>
         <w:ind w:left="720"/>
       </w:pPr>
       <w:r>
         <w:rPr>
           <w:rFonts w:ascii="Times New Roman" w:hAnsi="Times New Roman"/>
-          <w:b w:val="0"/>
-          <w:i/>
-          <w:sz w:val="24"/>
+          <w:sz w:val="22"/>
         </w:rPr>
-        <w:t>[EQ 11]  y_t = alpha + sum_{l=1}^{L} beta_l * y_{t-l} + sum_{l=1}^{L} gamma_l * x_{t-l} + epsilon_t</w:t>
+        <w:t xml:space="preserve">(11)  </w:t>
+      </w:r>
+      <w:r>
+        <w:rPr>
+          <w:rFonts w:ascii="Courier New" w:hAnsi="Courier New"/>
+          <w:sz w:val="20"/>
+        </w:rPr>
+        <w:t>y_t = \alpha + \sum_{l=1}^{L} \beta_l y_{t-l} + \sum_{l=1}^{L} \gamma_l x_{t-l} + \varepsilon_t</w:t>
       </w:r>
     </w:p>
     <w:p>

</xml_diff>